<commit_message>
Merge HFCS poster reference list into one numbered list (1-34)
Co-Authored-By: Claude Opus 5.5 <noreply@anthropic.com>
Claude-Session: https://claude.ai/code/session_01GDCp9vaBDB24tAeq3Z16Kb
</commit_message>
<xml_diff>
--- a/HFCS_Poster_Full_Reference_List.docx
+++ b/HFCS_Poster_Full_Reference_List.docx
@@ -20,12 +20,12 @@
         <w:pStyle w:val="Heading2"/>
       </w:pPr>
       <w:r>
-        <w:t>A. References cited on the poster</w:t>
+        <w:t>References</w:t>
       </w:r>
     </w:p>
     <w:p>
       <w:r>
-        <w:t>Numbered as they appear on the poster.</w:t>
+        <w:t>References 1–14 are cited on the poster and numbered as they appear there; references 15–34 are additional sources from the full paper and further reading.</w:t>
       </w:r>
     </w:p>
     <w:p>
@@ -241,23 +241,10 @@
     </w:p>
     <w:p>
       <w:pPr>
-        <w:pStyle w:val="Heading2"/>
-      </w:pPr>
-      <w:r>
-        <w:t>B. Additional references cited in the full paper (10)</w:t>
-      </w:r>
-    </w:p>
-    <w:p>
-      <w:r>
-        <w:t>Listed alphabetically by first author.</w:t>
-      </w:r>
-    </w:p>
-    <w:p>
-      <w:pPr>
         <w:spacing w:after="80"/>
       </w:pPr>
       <w:r>
-        <w:t xml:space="preserve">• Aoyagi T, Ohira G, Hayano K, Martin O, Takabe K. High-fructose corn syrup on inflammation and cancer. </w:t>
+        <w:t xml:space="preserve">15. Aoyagi T, Ohira G, Hayano K, Martin O, Takabe K. High-fructose corn syrup on inflammation and cancer. </w:t>
       </w:r>
       <w:r>
         <w:rPr>
@@ -274,7 +261,7 @@
         <w:spacing w:after="80"/>
       </w:pPr>
       <w:r>
-        <w:t>• Branded foods search. FoodData Central, US Department of Agriculture, Agricultural Research Service. Accessed December 13, 2025. https://fdc.nal.usda.gov/food-search?type=Branded</w:t>
+        <w:t>16. Branded foods search. FoodData Central, US Department of Agriculture, Agricultural Research Service. Accessed December 13, 2025. https://fdc.nal.usda.gov/food-search?type=Branded</w:t>
       </w:r>
     </w:p>
     <w:p>
@@ -282,7 +269,7 @@
         <w:spacing w:after="80"/>
       </w:pPr>
       <w:r>
-        <w:t xml:space="preserve">• Food labeling: revision of the Nutrition and Supplement Facts labels. </w:t>
+        <w:t xml:space="preserve">17. Food labeling: revision of the Nutrition and Supplement Facts labels. </w:t>
       </w:r>
       <w:r>
         <w:rPr>
@@ -299,7 +286,7 @@
         <w:spacing w:after="80"/>
       </w:pPr>
       <w:r>
-        <w:t xml:space="preserve">• Lancaster KJ. Current intake and demographic disparities in the association of fructose-rich foods and metabolic syndrome. </w:t>
+        <w:t xml:space="preserve">18. Lancaster KJ. Current intake and demographic disparities in the association of fructose-rich foods and metabolic syndrome. </w:t>
       </w:r>
       <w:r>
         <w:rPr>
@@ -316,7 +303,7 @@
         <w:spacing w:after="80"/>
       </w:pPr>
       <w:r>
-        <w:t xml:space="preserve">• Li Z, Forester S, Jennings-Dobbs E, Heber D. Perspective: a comprehensive evaluation of data quality in nutrient databases. </w:t>
+        <w:t xml:space="preserve">19. Li Z, Forester S, Jennings-Dobbs E, Heber D. Perspective: a comprehensive evaluation of data quality in nutrient databases. </w:t>
       </w:r>
       <w:r>
         <w:rPr>
@@ -333,7 +320,7 @@
         <w:spacing w:after="80"/>
       </w:pPr>
       <w:r>
-        <w:t xml:space="preserve">• Rippe JM. The health implications of sucrose, high-fructose corn syrup, and fructose: what do we really know? </w:t>
+        <w:t xml:space="preserve">20. Rippe JM. The health implications of sucrose, high-fructose corn syrup, and fructose: what do we really know? </w:t>
       </w:r>
       <w:r>
         <w:rPr>
@@ -350,7 +337,7 @@
         <w:spacing w:after="80"/>
       </w:pPr>
       <w:r>
-        <w:t xml:space="preserve">• Rizkalla SW. Health implications of fructose consumption: a review of recent data. </w:t>
+        <w:t xml:space="preserve">21. Rizkalla SW. Health implications of fructose consumption: a review of recent data. </w:t>
       </w:r>
       <w:r>
         <w:rPr>
@@ -367,7 +354,7 @@
         <w:spacing w:after="80"/>
       </w:pPr>
       <w:r>
-        <w:t xml:space="preserve">• US Department of Agriculture, Agricultural Research Service. </w:t>
+        <w:t xml:space="preserve">22. US Department of Agriculture, Agricultural Research Service. </w:t>
       </w:r>
       <w:r>
         <w:rPr>
@@ -384,7 +371,7 @@
         <w:spacing w:after="80"/>
       </w:pPr>
       <w:r>
-        <w:t>• US Department of Agriculture, Economic Research Service. High fructose corn syrup availability peaked in 1999. Published May 1, 2013. Accessed December 21, 2025. https://www.ers.usda.gov/data-products/chart-gallery/chart-detail?chartId=57655</w:t>
+        <w:t>23. US Department of Agriculture, Economic Research Service. High fructose corn syrup availability peaked in 1999. Published May 1, 2013. Accessed December 21, 2025. https://www.ers.usda.gov/data-products/chart-gallery/chart-detail?chartId=57655</w:t>
       </w:r>
     </w:p>
     <w:p>
@@ -392,7 +379,7 @@
         <w:spacing w:after="80"/>
       </w:pPr>
       <w:r>
-        <w:t xml:space="preserve">• US Department of Agriculture; US Department of Health and Human Services. </w:t>
+        <w:t xml:space="preserve">24. US Department of Agriculture; US Department of Health and Human Services. </w:t>
       </w:r>
       <w:r>
         <w:rPr>
@@ -406,23 +393,10 @@
     </w:p>
     <w:p>
       <w:pPr>
-        <w:pStyle w:val="Heading2"/>
-      </w:pPr>
-      <w:r>
-        <w:t>C. Further reading (10)</w:t>
-      </w:r>
-    </w:p>
-    <w:p>
-      <w:r>
-        <w:t>Key studies and guidance on high-fructose corn syrup, added sugars, and health. Listed alphabetically by first author.</w:t>
-      </w:r>
-    </w:p>
-    <w:p>
-      <w:pPr>
         <w:spacing w:after="80"/>
       </w:pPr>
       <w:r>
-        <w:t xml:space="preserve">• Bray GA, Nielsen SJ, Popkin BM. Consumption of high-fructose corn syrup in beverages may play a role in the epidemic of obesity. </w:t>
+        <w:t xml:space="preserve">25. Bray GA, Nielsen SJ, Popkin BM. Consumption of high-fructose corn syrup in beverages may play a role in the epidemic of obesity. </w:t>
       </w:r>
       <w:r>
         <w:rPr>
@@ -439,7 +413,7 @@
         <w:spacing w:after="80"/>
       </w:pPr>
       <w:r>
-        <w:t xml:space="preserve">• Goncalves MD, Lu C, Tutnauer J, et al. High-fructose corn syrup enhances intestinal tumor growth in mice. </w:t>
+        <w:t xml:space="preserve">26. Goncalves MD, Lu C, Tutnauer J, et al. High-fructose corn syrup enhances intestinal tumor growth in mice. </w:t>
       </w:r>
       <w:r>
         <w:rPr>
@@ -456,7 +430,7 @@
         <w:spacing w:after="80"/>
       </w:pPr>
       <w:r>
-        <w:t xml:space="preserve">• Goran MI, Ulijaszek SJ, Ventura EE. High fructose corn syrup and diabetes prevalence: a global perspective. </w:t>
+        <w:t xml:space="preserve">27. Goran MI, Ulijaszek SJ, Ventura EE. High fructose corn syrup and diabetes prevalence: a global perspective. </w:t>
       </w:r>
       <w:r>
         <w:rPr>
@@ -473,7 +447,7 @@
         <w:spacing w:after="80"/>
       </w:pPr>
       <w:r>
-        <w:t xml:space="preserve">• Malik VS, Hu FB. The role of sugar-sweetened beverages in the global epidemics of obesity and chronic diseases. </w:t>
+        <w:t xml:space="preserve">28. Malik VS, Hu FB. The role of sugar-sweetened beverages in the global epidemics of obesity and chronic diseases. </w:t>
       </w:r>
       <w:r>
         <w:rPr>
@@ -490,7 +464,7 @@
         <w:spacing w:after="80"/>
       </w:pPr>
       <w:r>
-        <w:t xml:space="preserve">• Ng SW, Slining MM, Popkin BM. Use of caloric and noncaloric sweeteners in US consumer packaged foods, 2005-2009. </w:t>
+        <w:t xml:space="preserve">29. Ng SW, Slining MM, Popkin BM. Use of caloric and noncaloric sweeteners in US consumer packaged foods, 2005-2009. </w:t>
       </w:r>
       <w:r>
         <w:rPr>
@@ -507,7 +481,7 @@
         <w:spacing w:after="80"/>
       </w:pPr>
       <w:r>
-        <w:t xml:space="preserve">• Popkin BM, Hawkes C. Sweetening of the global diet, particularly beverages: patterns, trends, and policy responses. </w:t>
+        <w:t xml:space="preserve">30. Popkin BM, Hawkes C. Sweetening of the global diet, particularly beverages: patterns, trends, and policy responses. </w:t>
       </w:r>
       <w:r>
         <w:rPr>
@@ -524,7 +498,7 @@
         <w:spacing w:after="80"/>
       </w:pPr>
       <w:r>
-        <w:t xml:space="preserve">• Ricciuto L, Fulgoni VL III, Gaine PC, Scott MO, DiFrancesco L. Sources of added sugars intake among the U.S. population: analysis by selected sociodemographic factors using the National Health and Nutrition Examination Survey 2011–18. </w:t>
+        <w:t xml:space="preserve">31. Ricciuto L, Fulgoni VL III, Gaine PC, Scott MO, DiFrancesco L. Sources of added sugars intake among the U.S. population: analysis by selected sociodemographic factors using the National Health and Nutrition Examination Survey 2011–18. </w:t>
       </w:r>
       <w:r>
         <w:rPr>
@@ -541,7 +515,7 @@
         <w:spacing w:after="80"/>
       </w:pPr>
       <w:r>
-        <w:t xml:space="preserve">• Stanhope KL, Schwarz JM, Keim NL, et al. Consuming fructose-sweetened, not glucose-sweetened, beverages increases visceral adiposity and lipids and decreases insulin sensitivity in overweight/obese humans. </w:t>
+        <w:t xml:space="preserve">32. Stanhope KL, Schwarz JM, Keim NL, et al. Consuming fructose-sweetened, not glucose-sweetened, beverages increases visceral adiposity and lipids and decreases insulin sensitivity in overweight/obese humans. </w:t>
       </w:r>
       <w:r>
         <w:rPr>
@@ -558,7 +532,7 @@
         <w:spacing w:after="80"/>
       </w:pPr>
       <w:r>
-        <w:t xml:space="preserve">• Te Morenga L, Mallard S, Mann J. Dietary sugars and body weight: systematic review and meta-analyses of randomised controlled trials and cohort studies. </w:t>
+        <w:t xml:space="preserve">33. Te Morenga L, Mallard S, Mann J. Dietary sugars and body weight: systematic review and meta-analyses of randomised controlled trials and cohort studies. </w:t>
       </w:r>
       <w:r>
         <w:rPr>
@@ -575,7 +549,7 @@
         <w:spacing w:after="80"/>
       </w:pPr>
       <w:r>
-        <w:t xml:space="preserve">• World Health Organization. </w:t>
+        <w:t xml:space="preserve">34. World Health Organization. </w:t>
       </w:r>
       <w:r>
         <w:rPr>

</xml_diff>